<commit_message>
Small updates to manuscript file
</commit_message>
<xml_diff>
--- a/Documents/Rind and Rosenberg_July2026_Revised.docx
+++ b/Documents/Rind and Rosenberg_July2026_Revised.docx
@@ -7345,7 +7345,7 @@
           <w:sz w:val="24"/>
           <w:szCs w:val="24"/>
         </w:rPr>
-        <w:t xml:space="preserve">by month, day of the week, and hour of the day </w:t>
+        <w:t xml:space="preserve">by </w:t>
       </w:r>
       <w:r>
         <w:rPr>
@@ -7353,6 +7353,22 @@
           <w:sz w:val="24"/>
           <w:szCs w:val="24"/>
         </w:rPr>
+        <w:t xml:space="preserve">hour of the </w:t>
+      </w:r>
+      <w:r>
+        <w:rPr>
+          <w:rFonts w:asciiTheme="majorBidi" w:eastAsia="Times New Roman" w:hAnsiTheme="majorBidi" w:cstheme="majorBidi"/>
+          <w:sz w:val="24"/>
+          <w:szCs w:val="24"/>
+        </w:rPr>
+        <w:t xml:space="preserve">month </w:t>
+      </w:r>
+      <w:r>
+        <w:rPr>
+          <w:rFonts w:asciiTheme="majorBidi" w:eastAsia="Times New Roman" w:hAnsiTheme="majorBidi" w:cstheme="majorBidi"/>
+          <w:sz w:val="24"/>
+          <w:szCs w:val="24"/>
+        </w:rPr>
         <w:t xml:space="preserve">for the remainder of the modeling, analysis, management recommendations, and discussion. </w:t>
       </w:r>
       <w:r>
@@ -7511,6 +7527,65 @@
         <w:rPr>
           <w:rFonts w:ascii="Times New Roman" w:eastAsia="Times New Roman" w:hAnsi="Times New Roman" w:cs="Times New Roman"/>
           <w:color w:val="000000"/>
+          <w:sz w:val="24"/>
+          <w:szCs w:val="24"/>
+        </w:rPr>
+        <w:t xml:space="preserve"> </w:t>
+      </w:r>
+      <w:r>
+        <w:rPr>
+          <w:rFonts w:ascii="Times New Roman" w:eastAsia="Times New Roman" w:hAnsi="Times New Roman" w:cs="Times New Roman"/>
+          <w:color w:val="000000"/>
+          <w:sz w:val="24"/>
+          <w:szCs w:val="24"/>
+        </w:rPr>
+        <w:t>We estimated</w:t>
+      </w:r>
+      <w:r>
+        <w:rPr>
+          <w:rFonts w:ascii="Times New Roman" w:eastAsia="Times New Roman" w:hAnsi="Times New Roman" w:cs="Times New Roman"/>
+          <w:color w:val="000000"/>
+          <w:sz w:val="24"/>
+          <w:szCs w:val="24"/>
+        </w:rPr>
+        <w:t xml:space="preserve"> 2024</w:t>
+      </w:r>
+      <w:r>
+        <w:rPr>
+          <w:rFonts w:ascii="Times New Roman" w:eastAsia="Times New Roman" w:hAnsi="Times New Roman" w:cs="Times New Roman"/>
+          <w:color w:val="000000"/>
+          <w:sz w:val="24"/>
+          <w:szCs w:val="24"/>
+        </w:rPr>
+        <w:t xml:space="preserve"> energy prices because </w:t>
+      </w:r>
+      <w:r>
+        <w:rPr>
+          <w:rFonts w:ascii="Times New Roman" w:hAnsi="Times New Roman" w:cs="Times New Roman"/>
+          <w:sz w:val="24"/>
+          <w:szCs w:val="24"/>
+        </w:rPr>
+        <w:t>Bair &amp; Yackulic (2024)</w:t>
+      </w:r>
+      <w:r>
+        <w:rPr>
+          <w:rFonts w:ascii="Times New Roman" w:hAnsi="Times New Roman" w:cs="Times New Roman"/>
+          <w:sz w:val="24"/>
+          <w:szCs w:val="24"/>
+        </w:rPr>
+        <w:t xml:space="preserve"> did not provide the underlying energy price data</w:t>
+      </w:r>
+      <w:r>
+        <w:rPr>
+          <w:rFonts w:ascii="Times New Roman" w:hAnsi="Times New Roman" w:cs="Times New Roman"/>
+          <w:sz w:val="24"/>
+          <w:szCs w:val="24"/>
+        </w:rPr>
+        <w:t>.</w:t>
+      </w:r>
+      <w:r>
+        <w:rPr>
+          <w:rFonts w:ascii="Times New Roman" w:hAnsi="Times New Roman" w:cs="Times New Roman"/>
           <w:sz w:val="24"/>
           <w:szCs w:val="24"/>
         </w:rPr>
@@ -12946,7 +13021,23 @@
           <w:sz w:val="24"/>
           <w:szCs w:val="24"/>
         </w:rPr>
-        <w:t>scenarios with the price premium</w:t>
+        <w:t xml:space="preserve">scenarios with </w:t>
+      </w:r>
+      <w:r>
+        <w:rPr>
+          <w:rFonts w:ascii="Times New Roman" w:eastAsia="Times New Roman" w:hAnsi="Times New Roman" w:cs="Times New Roman"/>
+          <w:sz w:val="24"/>
+          <w:szCs w:val="24"/>
+        </w:rPr>
+        <w:t>a</w:t>
+      </w:r>
+      <w:r>
+        <w:rPr>
+          <w:rFonts w:ascii="Times New Roman" w:eastAsia="Times New Roman" w:hAnsi="Times New Roman" w:cs="Times New Roman"/>
+          <w:sz w:val="24"/>
+          <w:szCs w:val="24"/>
+        </w:rPr>
+        <w:t xml:space="preserve"> price premium</w:t>
       </w:r>
       <w:r>
         <w:rPr>
@@ -16627,7 +16718,7 @@
         </w:rPr>
         <w:lastRenderedPageBreak/>
         <w:drawing>
-          <wp:inline distT="0" distB="0" distL="0" distR="0" wp14:anchorId="59AF2420" wp14:editId="200C32F7">
+          <wp:inline distT="0" distB="0" distL="0" distR="0" wp14:anchorId="59AF2420" wp14:editId="3FCBE591">
             <wp:extent cx="5115464" cy="3717989"/>
             <wp:effectExtent l="19050" t="19050" r="28575" b="15875"/>
             <wp:docPr id="3" name="Picture 3"/>
@@ -17052,7 +17143,23 @@
           <w:sz w:val="24"/>
           <w:szCs w:val="24"/>
         </w:rPr>
-        <w:t>/MWh increase above</w:t>
+        <w:t xml:space="preserve">/MWh </w:t>
+      </w:r>
+      <w:r>
+        <w:rPr>
+          <w:rFonts w:ascii="Times New Roman" w:hAnsi="Times New Roman" w:cs="Times New Roman"/>
+          <w:sz w:val="24"/>
+          <w:szCs w:val="24"/>
+        </w:rPr>
+        <w:t>premium</w:t>
+      </w:r>
+      <w:r>
+        <w:rPr>
+          <w:rFonts w:ascii="Times New Roman" w:hAnsi="Times New Roman" w:cs="Times New Roman"/>
+          <w:sz w:val="24"/>
+          <w:szCs w:val="24"/>
+        </w:rPr>
+        <w:t xml:space="preserve"> above</w:t>
       </w:r>
       <w:r>
         <w:rPr>
@@ -23349,7 +23456,23 @@
           <w:sz w:val="24"/>
           <w:szCs w:val="24"/>
         </w:rPr>
-        <w:t xml:space="preserve">When we tested sensitivity to 2014 energy prices, we found tradeoff curves of hydropeaking value vs number of days of steady low releases had the same shape as curves for 2024 energy prices, but the x-axis intercepts (hydropeaking value with zero days of steady low releases) were shifted left or right depending on changes in weekday and weekend peak- and off-peak prices (Supplementary, Table S7). For example, in March to June, weekday on- and off-peak and weekend off-peak hydropower prices were higher in 2014 than in 2024. Thus, </w:t>
+        <w:t>When we tested sensitivity to 2014 energy prices, we found tradeoff curves of hydropeaking value vs number of days of steady low releases had the same shape as curves for 2024 energy prices</w:t>
+      </w:r>
+      <w:r>
+        <w:rPr>
+          <w:rFonts w:asciiTheme="majorBidi" w:hAnsiTheme="majorBidi" w:cstheme="majorBidi"/>
+          <w:sz w:val="24"/>
+          <w:szCs w:val="24"/>
+        </w:rPr>
+        <w:t xml:space="preserve">. However, </w:t>
+      </w:r>
+      <w:r>
+        <w:rPr>
+          <w:rFonts w:asciiTheme="majorBidi" w:hAnsiTheme="majorBidi" w:cstheme="majorBidi"/>
+          <w:sz w:val="24"/>
+          <w:szCs w:val="24"/>
+        </w:rPr>
+        <w:t xml:space="preserve">the x-axis intercepts (hydropeaking value with zero days of steady low releases) were shifted left or right depending on changes in weekday and weekend peak- and off-peak prices (Supplementary, Table S7). For example, in March to June, weekday on- and off-peak and weekend off-peak hydropower prices were higher in 2014 than in 2024. Thus, </w:t>
       </w:r>
       <w:r>
         <w:rPr>
@@ -29228,7 +29351,20 @@
         <w:t xml:space="preserve"> </w:t>
       </w:r>
       <w:r>
-        <w:t>References</w:t>
+        <w:t>Refer</w:t>
+      </w:r>
+      <w:commentRangeStart w:id="42"/>
+      <w:r>
+        <w:t>ences</w:t>
+      </w:r>
+      <w:commentRangeEnd w:id="42"/>
+      <w:r>
+        <w:rPr>
+          <w:rStyle w:val="CommentReference"/>
+          <w:sz w:val="24"/>
+          <w:szCs w:val="28"/>
+        </w:rPr>
+        <w:commentReference w:id="42"/>
       </w:r>
       <w:r>
         <w:rPr>
@@ -29734,7 +29870,16 @@
         <w:t xml:space="preserve"> </w:t>
       </w:r>
       <w:r>
-        <w:t>https://github.com/moazzamalirind/BugFlowExperiment_Analysis2026</w:t>
+        <w:t>Hydroshare</w:t>
+      </w:r>
+      <w:r>
+        <w:t xml:space="preserve">. </w:t>
+      </w:r>
+      <w:r>
+        <w:t>https://www.hydroshare.org/resource/0df6ae0fa36a492ea42b9a05a72d6f30/</w:t>
+      </w:r>
+      <w:r>
+        <w:t>.</w:t>
       </w:r>
     </w:p>
     <w:p>
@@ -29959,12 +30104,12 @@
       </w:r>
     </w:p>
     <w:sectPr>
-      <w:headerReference w:type="even" r:id="rId19"/>
-      <w:headerReference w:type="default" r:id="rId20"/>
-      <w:footerReference w:type="even" r:id="rId21"/>
-      <w:footerReference w:type="default" r:id="rId22"/>
-      <w:headerReference w:type="first" r:id="rId23"/>
-      <w:footerReference w:type="first" r:id="rId24"/>
+      <w:headerReference w:type="even" r:id="rId23"/>
+      <w:headerReference w:type="default" r:id="rId24"/>
+      <w:footerReference w:type="even" r:id="rId25"/>
+      <w:footerReference w:type="default" r:id="rId26"/>
+      <w:headerReference w:type="first" r:id="rId27"/>
+      <w:footerReference w:type="first" r:id="rId28"/>
       <w:pgSz w:w="12240" w:h="15840"/>
       <w:pgMar w:top="1440" w:right="1440" w:bottom="1440" w:left="1440" w:header="720" w:footer="720" w:gutter="0"/>
       <w:lnNumType w:countBy="1" w:restart="continuous"/>
@@ -29973,6 +30118,56 @@
     </w:sectPr>
   </w:body>
 </w:document>
+</file>
+
+<file path=word/comments.xml><?xml version="1.0" encoding="utf-8"?>
+<w:comments xmlns:wpc="http://schemas.microsoft.com/office/word/2010/wordprocessingCanvas" xmlns:cx="http://schemas.microsoft.com/office/drawing/2014/chartex" xmlns:cx1="http://schemas.microsoft.com/office/drawing/2015/9/8/chartex" xmlns:cx2="http://schemas.microsoft.com/office/drawing/2015/10/21/chartex" xmlns:cx3="http://schemas.microsoft.com/office/drawing/2016/5/9/chartex" xmlns:cx4="http://schemas.microsoft.com/office/drawing/2016/5/10/chartex" xmlns:cx5="http://schemas.microsoft.com/office/drawing/2016/5/11/chartex" xmlns:cx6="http://schemas.microsoft.com/office/drawing/2016/5/12/chartex" xmlns:cx7="http://schemas.microsoft.com/office/drawing/2016/5/13/chartex" xmlns:cx8="http://schemas.microsoft.com/office/drawing/2016/5/14/chartex" xmlns:mc="http://schemas.openxmlformats.org/markup-compatibility/2006" xmlns:aink="http://schemas.microsoft.com/office/drawing/2016/ink" xmlns:am3d="http://schemas.microsoft.com/office/drawing/2017/model3d" xmlns:o="urn:schemas-microsoft-com:office:office" xmlns:oel="http://schemas.microsoft.com/office/2019/extlst" xmlns:r="http://schemas.openxmlformats.org/officeDocument/2006/relationships" xmlns:m="http://schemas.openxmlformats.org/officeDocument/2006/math" xmlns:v="urn:schemas-microsoft-com:vml" xmlns:wp14="http://schemas.microsoft.com/office/word/2010/wordprocessingDrawing" xmlns:wp="http://schemas.openxmlformats.org/drawingml/2006/wordprocessingDrawing" xmlns:w10="urn:schemas-microsoft-com:office:word" xmlns:w="http://schemas.openxmlformats.org/wordprocessingml/2006/main" xmlns:w14="http://schemas.microsoft.com/office/word/2010/wordml" xmlns:w15="http://schemas.microsoft.com/office/word/2012/wordml" xmlns:w16cei="http://schemas.microsoft.com/office/word/2026/wordml/cei" xmlns:w16cex="http://schemas.microsoft.com/office/word/2018/wordml/cex" xmlns:w16cid="http://schemas.microsoft.com/office/word/2016/wordml/cid" xmlns:w16="http://schemas.microsoft.com/office/word/2018/wordml" xmlns:w16du="http://schemas.microsoft.com/office/word/2023/wordml/word16du" xmlns:w16sdtdh="http://schemas.microsoft.com/office/word/2020/wordml/sdtdatahash" xmlns:w16sdtfl="http://schemas.microsoft.com/office/word/2024/wordml/sdtformatlock" xmlns:w16se="http://schemas.microsoft.com/office/word/2015/wordml/symex" xmlns:wpg="http://schemas.microsoft.com/office/word/2010/wordprocessingGroup" xmlns:wpi="http://schemas.microsoft.com/office/word/2010/wordprocessingInk" xmlns:wne="http://schemas.microsoft.com/office/word/2006/wordml" xmlns:wps="http://schemas.microsoft.com/office/word/2010/wordprocessingShape" mc:Ignorable="w14 w15 w16se w16cid w16 w16cex w16sdtdh w16sdtfl w16du wp14">
+  <w:comment w:id="42" w:author="David Rosenberg" w:date="2026-07-29T15:58:00Z" w:initials="DR">
+    <w:p>
+      <w:pPr>
+        <w:pStyle w:val="CommentText"/>
+      </w:pPr>
+      <w:r>
+        <w:rPr>
+          <w:rStyle w:val="CommentReference"/>
+        </w:rPr>
+        <w:annotationRef/>
+      </w:r>
+      <w:r>
+        <w:t xml:space="preserve">I update the URL on Rind and Rosenberg to be </w:t>
+      </w:r>
+      <w:hyperlink r:id="rId1" w:history="1">
+        <w:r>
+          <w:rPr>
+            <w:rStyle w:val="Hyperlink"/>
+          </w:rPr>
+          <w:t>https://www.hydroshare.org/resource/0df6ae0fa36a492ea42b9a05a72d6f30/</w:t>
+        </w:r>
+      </w:hyperlink>
+      <w:r>
+        <w:t>. Please update the bibliography before making a pdf.</w:t>
+      </w:r>
+    </w:p>
+  </w:comment>
+</w:comments>
+</file>
+
+<file path=word/commentsExtended.xml><?xml version="1.0" encoding="utf-8"?>
+<w15:commentsEx xmlns:wpc="http://schemas.microsoft.com/office/word/2010/wordprocessingCanvas" xmlns:cx="http://schemas.microsoft.com/office/drawing/2014/chartex" xmlns:cx1="http://schemas.microsoft.com/office/drawing/2015/9/8/chartex" xmlns:cx2="http://schemas.microsoft.com/office/drawing/2015/10/21/chartex" xmlns:cx3="http://schemas.microsoft.com/office/drawing/2016/5/9/chartex" xmlns:cx4="http://schemas.microsoft.com/office/drawing/2016/5/10/chartex" xmlns:cx5="http://schemas.microsoft.com/office/drawing/2016/5/11/chartex" xmlns:cx6="http://schemas.microsoft.com/office/drawing/2016/5/12/chartex" xmlns:cx7="http://schemas.microsoft.com/office/drawing/2016/5/13/chartex" xmlns:cx8="http://schemas.microsoft.com/office/drawing/2016/5/14/chartex" xmlns:mc="http://schemas.openxmlformats.org/markup-compatibility/2006" xmlns:aink="http://schemas.microsoft.com/office/drawing/2016/ink" xmlns:am3d="http://schemas.microsoft.com/office/drawing/2017/model3d" xmlns:o="urn:schemas-microsoft-com:office:office" xmlns:oel="http://schemas.microsoft.com/office/2019/extlst" xmlns:r="http://schemas.openxmlformats.org/officeDocument/2006/relationships" xmlns:m="http://schemas.openxmlformats.org/officeDocument/2006/math" xmlns:v="urn:schemas-microsoft-com:vml" xmlns:wp14="http://schemas.microsoft.com/office/word/2010/wordprocessingDrawing" xmlns:wp="http://schemas.openxmlformats.org/drawingml/2006/wordprocessingDrawing" xmlns:w10="urn:schemas-microsoft-com:office:word" xmlns:w="http://schemas.openxmlformats.org/wordprocessingml/2006/main" xmlns:w14="http://schemas.microsoft.com/office/word/2010/wordml" xmlns:w15="http://schemas.microsoft.com/office/word/2012/wordml" xmlns:w16cei="http://schemas.microsoft.com/office/word/2026/wordml/cei" xmlns:w16cex="http://schemas.microsoft.com/office/word/2018/wordml/cex" xmlns:w16cid="http://schemas.microsoft.com/office/word/2016/wordml/cid" xmlns:w16="http://schemas.microsoft.com/office/word/2018/wordml" xmlns:w16du="http://schemas.microsoft.com/office/word/2023/wordml/word16du" xmlns:w16sdtdh="http://schemas.microsoft.com/office/word/2020/wordml/sdtdatahash" xmlns:w16sdtfl="http://schemas.microsoft.com/office/word/2024/wordml/sdtformatlock" xmlns:w16se="http://schemas.microsoft.com/office/word/2015/wordml/symex" xmlns:wpg="http://schemas.microsoft.com/office/word/2010/wordprocessingGroup" xmlns:wpi="http://schemas.microsoft.com/office/word/2010/wordprocessingInk" xmlns:wne="http://schemas.microsoft.com/office/word/2006/wordml" xmlns:wps="http://schemas.microsoft.com/office/word/2010/wordprocessingShape" mc:Ignorable="w14 w15 w16se w16cid w16 w16cex w16sdtdh w16sdtfl w16du wp14">
+  <w15:commentEx w15:paraId="0F69C48B" w15:done="0"/>
+</w15:commentsEx>
+</file>
+
+<file path=word/commentsExtensible.xml><?xml version="1.0" encoding="utf-8"?>
+<w16cex:commentsExtensible xmlns:wpc="http://schemas.microsoft.com/office/word/2010/wordprocessingCanvas" xmlns:cx="http://schemas.microsoft.com/office/drawing/2014/chartex" xmlns:cx1="http://schemas.microsoft.com/office/drawing/2015/9/8/chartex" xmlns:cx2="http://schemas.microsoft.com/office/drawing/2015/10/21/chartex" xmlns:cx3="http://schemas.microsoft.com/office/drawing/2016/5/9/chartex" xmlns:cx4="http://schemas.microsoft.com/office/drawing/2016/5/10/chartex" xmlns:cx5="http://schemas.microsoft.com/office/drawing/2016/5/11/chartex" xmlns:cx6="http://schemas.microsoft.com/office/drawing/2016/5/12/chartex" xmlns:cx7="http://schemas.microsoft.com/office/drawing/2016/5/13/chartex" xmlns:cx8="http://schemas.microsoft.com/office/drawing/2016/5/14/chartex" xmlns:cr="http://schemas.microsoft.com/office/comments/2020/reactions" xmlns:mc="http://schemas.openxmlformats.org/markup-compatibility/2006" xmlns:aink="http://schemas.microsoft.com/office/drawing/2016/ink" xmlns:am3d="http://schemas.microsoft.com/office/drawing/2017/model3d" xmlns:o="urn:schemas-microsoft-com:office:office" xmlns:oel="http://schemas.microsoft.com/office/2019/extlst" xmlns:r="http://schemas.openxmlformats.org/officeDocument/2006/relationships" xmlns:m="http://schemas.openxmlformats.org/officeDocument/2006/math" xmlns:v="urn:schemas-microsoft-com:vml" xmlns:wp14="http://schemas.microsoft.com/office/word/2010/wordprocessingDrawing" xmlns:wp="http://schemas.openxmlformats.org/drawingml/2006/wordprocessingDrawing" xmlns:w10="urn:schemas-microsoft-com:office:word" xmlns:w="http://schemas.openxmlformats.org/wordprocessingml/2006/main" xmlns:w14="http://schemas.microsoft.com/office/word/2010/wordml" xmlns:w15="http://schemas.microsoft.com/office/word/2012/wordml" xmlns:w16cei="http://schemas.microsoft.com/office/word/2026/wordml/cei" xmlns:w16cex="http://schemas.microsoft.com/office/word/2018/wordml/cex" xmlns:w16cid="http://schemas.microsoft.com/office/word/2016/wordml/cid" xmlns:w16="http://schemas.microsoft.com/office/word/2018/wordml" xmlns:w16du="http://schemas.microsoft.com/office/word/2023/wordml/word16du" xmlns:w16sdtdh="http://schemas.microsoft.com/office/word/2020/wordml/sdtdatahash" xmlns:w16sdtfl="http://schemas.microsoft.com/office/word/2024/wordml/sdtformatlock" xmlns:w16se="http://schemas.microsoft.com/office/word/2015/wordml/symex" xmlns:wpg="http://schemas.microsoft.com/office/word/2010/wordprocessingGroup" xmlns:wpi="http://schemas.microsoft.com/office/word/2010/wordprocessingInk" xmlns:wne="http://schemas.microsoft.com/office/word/2006/wordml" xmlns:wps="http://schemas.microsoft.com/office/word/2010/wordprocessingShape" mc:Ignorable="w14 w15 w16se w16cid w16 w16cex w16sdtdh w16sdtfl cr w16du wp14">
+  <w16cex:commentExtensible w16cex:durableId="515069E1" w16cex:dateUtc="2026-07-29T21:58:00Z"/>
+</w16cex:commentsExtensible>
+</file>
+
+<file path=word/commentsIds.xml><?xml version="1.0" encoding="utf-8"?>
+<w16cid:commentsIds xmlns:wpc="http://schemas.microsoft.com/office/word/2010/wordprocessingCanvas" xmlns:cx="http://schemas.microsoft.com/office/drawing/2014/chartex" xmlns:cx1="http://schemas.microsoft.com/office/drawing/2015/9/8/chartex" xmlns:cx2="http://schemas.microsoft.com/office/drawing/2015/10/21/chartex" xmlns:cx3="http://schemas.microsoft.com/office/drawing/2016/5/9/chartex" xmlns:cx4="http://schemas.microsoft.com/office/drawing/2016/5/10/chartex" xmlns:cx5="http://schemas.microsoft.com/office/drawing/2016/5/11/chartex" xmlns:cx6="http://schemas.microsoft.com/office/drawing/2016/5/12/chartex" xmlns:cx7="http://schemas.microsoft.com/office/drawing/2016/5/13/chartex" xmlns:cx8="http://schemas.microsoft.com/office/drawing/2016/5/14/chartex" xmlns:mc="http://schemas.openxmlformats.org/markup-compatibility/2006" xmlns:aink="http://schemas.microsoft.com/office/drawing/2016/ink" xmlns:am3d="http://schemas.microsoft.com/office/drawing/2017/model3d" xmlns:o="urn:schemas-microsoft-com:office:office" xmlns:oel="http://schemas.microsoft.com/office/2019/extlst" xmlns:r="http://schemas.openxmlformats.org/officeDocument/2006/relationships" xmlns:m="http://schemas.openxmlformats.org/officeDocument/2006/math" xmlns:v="urn:schemas-microsoft-com:vml" xmlns:wp14="http://schemas.microsoft.com/office/word/2010/wordprocessingDrawing" xmlns:wp="http://schemas.openxmlformats.org/drawingml/2006/wordprocessingDrawing" xmlns:w10="urn:schemas-microsoft-com:office:word" xmlns:w="http://schemas.openxmlformats.org/wordprocessingml/2006/main" xmlns:w14="http://schemas.microsoft.com/office/word/2010/wordml" xmlns:w15="http://schemas.microsoft.com/office/word/2012/wordml" xmlns:w16cei="http://schemas.microsoft.com/office/word/2026/wordml/cei" xmlns:w16cex="http://schemas.microsoft.com/office/word/2018/wordml/cex" xmlns:w16cid="http://schemas.microsoft.com/office/word/2016/wordml/cid" xmlns:w16="http://schemas.microsoft.com/office/word/2018/wordml" xmlns:w16du="http://schemas.microsoft.com/office/word/2023/wordml/word16du" xmlns:w16sdtdh="http://schemas.microsoft.com/office/word/2020/wordml/sdtdatahash" xmlns:w16sdtfl="http://schemas.microsoft.com/office/word/2024/wordml/sdtformatlock" xmlns:w16se="http://schemas.microsoft.com/office/word/2015/wordml/symex" xmlns:wpg="http://schemas.microsoft.com/office/word/2010/wordprocessingGroup" xmlns:wpi="http://schemas.microsoft.com/office/word/2010/wordprocessingInk" xmlns:wne="http://schemas.microsoft.com/office/word/2006/wordml" xmlns:wps="http://schemas.microsoft.com/office/word/2010/wordprocessingShape" mc:Ignorable="w14 w15 w16se w16cid w16 w16cex w16sdtdh w16sdtfl w16du wp14">
+  <w16cid:commentId w16cid:paraId="0F69C48B" w16cid:durableId="515069E1"/>
+</w16cid:commentsIds>
 </file>
 
 <file path=word/endnotes.xml><?xml version="1.0" encoding="utf-8"?>
@@ -32782,6 +32977,14 @@
     <w:abstractNumId w:val="3"/>
   </w:num>
 </w:numbering>
+</file>
+
+<file path=word/people.xml><?xml version="1.0" encoding="utf-8"?>
+<w15:people xmlns:wpc="http://schemas.microsoft.com/office/word/2010/wordprocessingCanvas" xmlns:cx="http://schemas.microsoft.com/office/drawing/2014/chartex" xmlns:cx1="http://schemas.microsoft.com/office/drawing/2015/9/8/chartex" xmlns:cx2="http://schemas.microsoft.com/office/drawing/2015/10/21/chartex" xmlns:cx3="http://schemas.microsoft.com/office/drawing/2016/5/9/chartex" xmlns:cx4="http://schemas.microsoft.com/office/drawing/2016/5/10/chartex" xmlns:cx5="http://schemas.microsoft.com/office/drawing/2016/5/11/chartex" xmlns:cx6="http://schemas.microsoft.com/office/drawing/2016/5/12/chartex" xmlns:cx7="http://schemas.microsoft.com/office/drawing/2016/5/13/chartex" xmlns:cx8="http://schemas.microsoft.com/office/drawing/2016/5/14/chartex" xmlns:mc="http://schemas.openxmlformats.org/markup-compatibility/2006" xmlns:aink="http://schemas.microsoft.com/office/drawing/2016/ink" xmlns:am3d="http://schemas.microsoft.com/office/drawing/2017/model3d" xmlns:o="urn:schemas-microsoft-com:office:office" xmlns:oel="http://schemas.microsoft.com/office/2019/extlst" xmlns:r="http://schemas.openxmlformats.org/officeDocument/2006/relationships" xmlns:m="http://schemas.openxmlformats.org/officeDocument/2006/math" xmlns:v="urn:schemas-microsoft-com:vml" xmlns:wp14="http://schemas.microsoft.com/office/word/2010/wordprocessingDrawing" xmlns:wp="http://schemas.openxmlformats.org/drawingml/2006/wordprocessingDrawing" xmlns:w10="urn:schemas-microsoft-com:office:word" xmlns:w="http://schemas.openxmlformats.org/wordprocessingml/2006/main" xmlns:w14="http://schemas.microsoft.com/office/word/2010/wordml" xmlns:w15="http://schemas.microsoft.com/office/word/2012/wordml" xmlns:w16cei="http://schemas.microsoft.com/office/word/2026/wordml/cei" xmlns:w16cex="http://schemas.microsoft.com/office/word/2018/wordml/cex" xmlns:w16cid="http://schemas.microsoft.com/office/word/2016/wordml/cid" xmlns:w16="http://schemas.microsoft.com/office/word/2018/wordml" xmlns:w16du="http://schemas.microsoft.com/office/word/2023/wordml/word16du" xmlns:w16sdtdh="http://schemas.microsoft.com/office/word/2020/wordml/sdtdatahash" xmlns:w16sdtfl="http://schemas.microsoft.com/office/word/2024/wordml/sdtformatlock" xmlns:w16se="http://schemas.microsoft.com/office/word/2015/wordml/symex" xmlns:wpg="http://schemas.microsoft.com/office/word/2010/wordprocessingGroup" xmlns:wpi="http://schemas.microsoft.com/office/word/2010/wordprocessingInk" xmlns:wne="http://schemas.microsoft.com/office/word/2006/wordml" xmlns:wps="http://schemas.microsoft.com/office/word/2010/wordprocessingShape" mc:Ignorable="w14 w15 w16se w16cid w16 w16cex w16sdtdh w16sdtfl w16du wp14">
+  <w15:person w15:author="David Rosenberg">
+    <w15:presenceInfo w15:providerId="None" w15:userId="David Rosenberg"/>
+  </w15:person>
+</w15:people>
 </file>
 
 <file path=word/styles.xml><?xml version="1.0" encoding="utf-8"?>
@@ -34188,6 +34391,18 @@
       <w:shd w:val="clear" w:color="auto" w:fill="E1DFDD"/>
     </w:rPr>
   </w:style>
+  <w:style w:type="character" w:styleId="UnresolvedMention">
+    <w:name w:val="Unresolved Mention"/>
+    <w:basedOn w:val="DefaultParagraphFont"/>
+    <w:uiPriority w:val="99"/>
+    <w:semiHidden/>
+    <w:unhideWhenUsed/>
+    <w:rsid w:val="00531F22"/>
+    <w:rPr>
+      <w:color w:val="605E5C"/>
+      <w:shd w:val="clear" w:color="auto" w:fill="E1DFDD"/>
+    </w:rPr>
+  </w:style>
 </w:styles>
 </file>
 
@@ -34453,7 +34668,12 @@
 </file>
 
 <file path=customXml/item1.xml><?xml version="1.0" encoding="utf-8"?>
-<b:Sources xmlns:b="http://schemas.openxmlformats.org/officeDocument/2006/bibliography" xmlns="http://schemas.openxmlformats.org/officeDocument/2006/bibliography" SelectedStyle="\APASixthEditionOfficeOnline.xsl" StyleName="APA" Version="6"/>
+<?mso-contentType ?>
+<FormTemplates xmlns="http://schemas.microsoft.com/sharepoint/v3/contenttype/forms">
+  <Display>DocumentLibraryForm</Display>
+  <Edit>DocumentLibraryForm</Edit>
+  <New>DocumentLibraryForm</New>
+</FormTemplates>
 </file>
 
 <file path=customXml/item2.xml><?xml version="1.0" encoding="utf-8"?>
@@ -34465,12 +34685,7 @@
 </file>
 
 <file path=customXml/item3.xml><?xml version="1.0" encoding="utf-8"?>
-<?mso-contentType ?>
-<FormTemplates xmlns="http://schemas.microsoft.com/sharepoint/v3/contenttype/forms">
-  <Display>DocumentLibraryForm</Display>
-  <Edit>DocumentLibraryForm</Edit>
-  <New>DocumentLibraryForm</New>
-</FormTemplates>
+<b:Sources xmlns:b="http://schemas.openxmlformats.org/officeDocument/2006/bibliography" xmlns="http://schemas.openxmlformats.org/officeDocument/2006/bibliography" SelectedStyle="\APASixthEditionOfficeOnline.xsl" StyleName="APA" Version="6"/>
 </file>
 
 <file path=customXml/item4.xml><?xml version="1.0" encoding="utf-8"?>
@@ -34727,9 +34942,9 @@
 </file>
 
 <file path=customXml/itemProps1.xml><?xml version="1.0" encoding="utf-8"?>
-<ds:datastoreItem xmlns:ds="http://schemas.openxmlformats.org/officeDocument/2006/customXml" ds:itemID="{5F210B13-2118-4C2E-9C58-D70C0E8251E9}">
+<ds:datastoreItem xmlns:ds="http://schemas.openxmlformats.org/officeDocument/2006/customXml" ds:itemID="{F87A1911-26B3-44EC-B6AD-02FE49418F50}">
   <ds:schemaRefs>
-    <ds:schemaRef ds:uri="http://schemas.openxmlformats.org/officeDocument/2006/bibliography"/>
+    <ds:schemaRef ds:uri="http://schemas.microsoft.com/sharepoint/v3/contenttype/forms"/>
   </ds:schemaRefs>
 </ds:datastoreItem>
 </file>
@@ -34745,9 +34960,9 @@
 </file>
 
 <file path=customXml/itemProps3.xml><?xml version="1.0" encoding="utf-8"?>
-<ds:datastoreItem xmlns:ds="http://schemas.openxmlformats.org/officeDocument/2006/customXml" ds:itemID="{F87A1911-26B3-44EC-B6AD-02FE49418F50}">
+<ds:datastoreItem xmlns:ds="http://schemas.openxmlformats.org/officeDocument/2006/customXml" ds:itemID="{5F210B13-2118-4C2E-9C58-D70C0E8251E9}">
   <ds:schemaRefs>
-    <ds:schemaRef ds:uri="http://schemas.microsoft.com/sharepoint/v3/contenttype/forms"/>
+    <ds:schemaRef ds:uri="http://schemas.openxmlformats.org/officeDocument/2006/bibliography"/>
   </ds:schemaRefs>
 </ds:datastoreItem>
 </file>

</xml_diff>